<commit_message>
Updated templates with Adelaide Uni logo
</commit_message>
<xml_diff>
--- a/inst/extdata/_extensions/aagi-report/assets/template.docx
+++ b/inst/extdata/_extensions/aagi-report/assets/template.docx
@@ -1,6 +1,6 @@
 
 <file path=word/document.xml><?xml version="1.0" encoding="utf-8"?>
-<w:document xmlns:wpc="http://schemas.microsoft.com/office/word/2010/wordprocessingCanvas" xmlns:cx="http://schemas.microsoft.com/office/drawing/2014/chartex" xmlns:cx1="http://schemas.microsoft.com/office/drawing/2015/9/8/chartex" xmlns:cx2="http://schemas.microsoft.com/office/drawing/2015/10/21/chartex" xmlns:cx3="http://schemas.microsoft.com/office/drawing/2016/5/9/chartex" xmlns:cx4="http://schemas.microsoft.com/office/drawing/2016/5/10/chartex" xmlns:cx5="http://schemas.microsoft.com/office/drawing/2016/5/11/chartex" xmlns:cx6="http://schemas.microsoft.com/office/drawing/2016/5/12/chartex" xmlns:cx7="http://schemas.microsoft.com/office/drawing/2016/5/13/chartex" xmlns:cx8="http://schemas.microsoft.com/office/drawing/2016/5/14/chartex" xmlns:mc="http://schemas.openxmlformats.org/markup-compatibility/2006" xmlns:aink="http://schemas.microsoft.com/office/drawing/2016/ink" xmlns:am3d="http://schemas.microsoft.com/office/drawing/2017/model3d" xmlns:o="urn:schemas-microsoft-com:office:office" xmlns:oel="http://schemas.microsoft.com/office/2019/extlst" xmlns:r="http://schemas.openxmlformats.org/officeDocument/2006/relationships" xmlns:m="http://schemas.openxmlformats.org/officeDocument/2006/math" xmlns:v="urn:schemas-microsoft-com:vml" xmlns:wp14="http://schemas.microsoft.com/office/word/2010/wordprocessingDrawing" xmlns:wp="http://schemas.openxmlformats.org/drawingml/2006/wordprocessingDrawing" xmlns:w10="urn:schemas-microsoft-com:office:word" xmlns:w="http://schemas.openxmlformats.org/wordprocessingml/2006/main" xmlns:w14="http://schemas.microsoft.com/office/word/2010/wordml" xmlns:w15="http://schemas.microsoft.com/office/word/2012/wordml" xmlns:w16cex="http://schemas.microsoft.com/office/word/2018/wordml/cex" xmlns:w16cid="http://schemas.microsoft.com/office/word/2016/wordml/cid" xmlns:w16="http://schemas.microsoft.com/office/word/2018/wordml" xmlns:w16du="http://schemas.microsoft.com/office/word/2023/wordml/word16du" xmlns:w16sdtdh="http://schemas.microsoft.com/office/word/2020/wordml/sdtdatahash" xmlns:w16se="http://schemas.microsoft.com/office/word/2015/wordml/symex" xmlns:wpg="http://schemas.microsoft.com/office/word/2010/wordprocessingGroup" xmlns:wpi="http://schemas.microsoft.com/office/word/2010/wordprocessingInk" xmlns:wne="http://schemas.microsoft.com/office/word/2006/wordml" xmlns:wps="http://schemas.microsoft.com/office/word/2010/wordprocessingShape" mc:Ignorable="w14 w15 w16se w16cid w16 w16cex w16sdtdh w16du wp14">
+<w:document xmlns:wpc="http://schemas.microsoft.com/office/word/2010/wordprocessingCanvas" xmlns:cx="http://schemas.microsoft.com/office/drawing/2014/chartex" xmlns:cx1="http://schemas.microsoft.com/office/drawing/2015/9/8/chartex" xmlns:cx2="http://schemas.microsoft.com/office/drawing/2015/10/21/chartex" xmlns:cx3="http://schemas.microsoft.com/office/drawing/2016/5/9/chartex" xmlns:cx4="http://schemas.microsoft.com/office/drawing/2016/5/10/chartex" xmlns:cx5="http://schemas.microsoft.com/office/drawing/2016/5/11/chartex" xmlns:cx6="http://schemas.microsoft.com/office/drawing/2016/5/12/chartex" xmlns:cx7="http://schemas.microsoft.com/office/drawing/2016/5/13/chartex" xmlns:cx8="http://schemas.microsoft.com/office/drawing/2016/5/14/chartex" xmlns:mc="http://schemas.openxmlformats.org/markup-compatibility/2006" xmlns:aink="http://schemas.microsoft.com/office/drawing/2016/ink" xmlns:am3d="http://schemas.microsoft.com/office/drawing/2017/model3d" xmlns:o="urn:schemas-microsoft-com:office:office" xmlns:oel="http://schemas.microsoft.com/office/2019/extlst" xmlns:r="http://schemas.openxmlformats.org/officeDocument/2006/relationships" xmlns:m="http://schemas.openxmlformats.org/officeDocument/2006/math" xmlns:v="urn:schemas-microsoft-com:vml" xmlns:wp14="http://schemas.microsoft.com/office/word/2010/wordprocessingDrawing" xmlns:wp="http://schemas.openxmlformats.org/drawingml/2006/wordprocessingDrawing" xmlns:w10="urn:schemas-microsoft-com:office:word" xmlns:w="http://schemas.openxmlformats.org/wordprocessingml/2006/main" xmlns:w14="http://schemas.microsoft.com/office/word/2010/wordml" xmlns:w15="http://schemas.microsoft.com/office/word/2012/wordml" xmlns:w16cex="http://schemas.microsoft.com/office/word/2018/wordml/cex" xmlns:w16cid="http://schemas.microsoft.com/office/word/2016/wordml/cid" xmlns:w16="http://schemas.microsoft.com/office/word/2018/wordml" xmlns:w16du="http://schemas.microsoft.com/office/word/2023/wordml/word16du" xmlns:w16sdtdh="http://schemas.microsoft.com/office/word/2020/wordml/sdtdatahash" xmlns:w16sdtfl="http://schemas.microsoft.com/office/word/2024/wordml/sdtformatlock" xmlns:w16se="http://schemas.microsoft.com/office/word/2015/wordml/symex" xmlns:wpg="http://schemas.microsoft.com/office/word/2010/wordprocessingGroup" xmlns:wpi="http://schemas.microsoft.com/office/word/2010/wordprocessingInk" xmlns:wne="http://schemas.microsoft.com/office/word/2006/wordml" xmlns:wps="http://schemas.microsoft.com/office/word/2010/wordprocessingShape" mc:Ignorable="w14 w15 w16se w16cid w16 w16cex w16sdtdh w16sdtfl w16du wp14">
   <w:body>
     <w:p>
       <w:pPr>
@@ -1543,7 +1543,6 @@
               <w:pStyle w:val="Compact"/>
             </w:pPr>
             <w:r>
-              <w:lastRenderedPageBreak/>
               <w:t>Hornet 4 Drive</w:t>
             </w:r>
           </w:p>
@@ -2069,7 +2068,7 @@
 </file>
 
 <file path=word/endnotes.xml><?xml version="1.0" encoding="utf-8"?>
-<w:endnotes xmlns:wpc="http://schemas.microsoft.com/office/word/2010/wordprocessingCanvas" xmlns:cx="http://schemas.microsoft.com/office/drawing/2014/chartex" xmlns:cx1="http://schemas.microsoft.com/office/drawing/2015/9/8/chartex" xmlns:cx2="http://schemas.microsoft.com/office/drawing/2015/10/21/chartex" xmlns:cx3="http://schemas.microsoft.com/office/drawing/2016/5/9/chartex" xmlns:cx4="http://schemas.microsoft.com/office/drawing/2016/5/10/chartex" xmlns:cx5="http://schemas.microsoft.com/office/drawing/2016/5/11/chartex" xmlns:cx6="http://schemas.microsoft.com/office/drawing/2016/5/12/chartex" xmlns:cx7="http://schemas.microsoft.com/office/drawing/2016/5/13/chartex" xmlns:cx8="http://schemas.microsoft.com/office/drawing/2016/5/14/chartex" xmlns:mc="http://schemas.openxmlformats.org/markup-compatibility/2006" xmlns:aink="http://schemas.microsoft.com/office/drawing/2016/ink" xmlns:am3d="http://schemas.microsoft.com/office/drawing/2017/model3d" xmlns:o="urn:schemas-microsoft-com:office:office" xmlns:oel="http://schemas.microsoft.com/office/2019/extlst" xmlns:r="http://schemas.openxmlformats.org/officeDocument/2006/relationships" xmlns:m="http://schemas.openxmlformats.org/officeDocument/2006/math" xmlns:v="urn:schemas-microsoft-com:vml" xmlns:wp14="http://schemas.microsoft.com/office/word/2010/wordprocessingDrawing" xmlns:wp="http://schemas.openxmlformats.org/drawingml/2006/wordprocessingDrawing" xmlns:w10="urn:schemas-microsoft-com:office:word" xmlns:w="http://schemas.openxmlformats.org/wordprocessingml/2006/main" xmlns:w14="http://schemas.microsoft.com/office/word/2010/wordml" xmlns:w15="http://schemas.microsoft.com/office/word/2012/wordml" xmlns:w16cex="http://schemas.microsoft.com/office/word/2018/wordml/cex" xmlns:w16cid="http://schemas.microsoft.com/office/word/2016/wordml/cid" xmlns:w16="http://schemas.microsoft.com/office/word/2018/wordml" xmlns:w16du="http://schemas.microsoft.com/office/word/2023/wordml/word16du" xmlns:w16sdtdh="http://schemas.microsoft.com/office/word/2020/wordml/sdtdatahash" xmlns:w16se="http://schemas.microsoft.com/office/word/2015/wordml/symex" xmlns:wpg="http://schemas.microsoft.com/office/word/2010/wordprocessingGroup" xmlns:wpi="http://schemas.microsoft.com/office/word/2010/wordprocessingInk" xmlns:wne="http://schemas.microsoft.com/office/word/2006/wordml" xmlns:wps="http://schemas.microsoft.com/office/word/2010/wordprocessingShape" mc:Ignorable="w14 w15 w16se w16cid w16 w16cex w16sdtdh w16du wp14">
+<w:endnotes xmlns:wpc="http://schemas.microsoft.com/office/word/2010/wordprocessingCanvas" xmlns:cx="http://schemas.microsoft.com/office/drawing/2014/chartex" xmlns:cx1="http://schemas.microsoft.com/office/drawing/2015/9/8/chartex" xmlns:cx2="http://schemas.microsoft.com/office/drawing/2015/10/21/chartex" xmlns:cx3="http://schemas.microsoft.com/office/drawing/2016/5/9/chartex" xmlns:cx4="http://schemas.microsoft.com/office/drawing/2016/5/10/chartex" xmlns:cx5="http://schemas.microsoft.com/office/drawing/2016/5/11/chartex" xmlns:cx6="http://schemas.microsoft.com/office/drawing/2016/5/12/chartex" xmlns:cx7="http://schemas.microsoft.com/office/drawing/2016/5/13/chartex" xmlns:cx8="http://schemas.microsoft.com/office/drawing/2016/5/14/chartex" xmlns:mc="http://schemas.openxmlformats.org/markup-compatibility/2006" xmlns:aink="http://schemas.microsoft.com/office/drawing/2016/ink" xmlns:am3d="http://schemas.microsoft.com/office/drawing/2017/model3d" xmlns:o="urn:schemas-microsoft-com:office:office" xmlns:oel="http://schemas.microsoft.com/office/2019/extlst" xmlns:r="http://schemas.openxmlformats.org/officeDocument/2006/relationships" xmlns:m="http://schemas.openxmlformats.org/officeDocument/2006/math" xmlns:v="urn:schemas-microsoft-com:vml" xmlns:wp14="http://schemas.microsoft.com/office/word/2010/wordprocessingDrawing" xmlns:wp="http://schemas.openxmlformats.org/drawingml/2006/wordprocessingDrawing" xmlns:w10="urn:schemas-microsoft-com:office:word" xmlns:w="http://schemas.openxmlformats.org/wordprocessingml/2006/main" xmlns:w14="http://schemas.microsoft.com/office/word/2010/wordml" xmlns:w15="http://schemas.microsoft.com/office/word/2012/wordml" xmlns:w16cex="http://schemas.microsoft.com/office/word/2018/wordml/cex" xmlns:w16cid="http://schemas.microsoft.com/office/word/2016/wordml/cid" xmlns:w16="http://schemas.microsoft.com/office/word/2018/wordml" xmlns:w16du="http://schemas.microsoft.com/office/word/2023/wordml/word16du" xmlns:w16sdtdh="http://schemas.microsoft.com/office/word/2020/wordml/sdtdatahash" xmlns:w16sdtfl="http://schemas.microsoft.com/office/word/2024/wordml/sdtformatlock" xmlns:w16se="http://schemas.microsoft.com/office/word/2015/wordml/symex" xmlns:wpg="http://schemas.microsoft.com/office/word/2010/wordprocessingGroup" xmlns:wpi="http://schemas.microsoft.com/office/word/2010/wordprocessingInk" xmlns:wne="http://schemas.microsoft.com/office/word/2006/wordml" xmlns:wps="http://schemas.microsoft.com/office/word/2010/wordprocessingShape" mc:Ignorable="w14 w15 w16se w16cid w16 w16cex w16sdtdh w16sdtfl w16du wp14">
   <w:endnote w:type="separator" w:id="-1">
     <w:p>
       <w:pPr>
@@ -2094,7 +2093,7 @@
 </file>
 
 <file path=word/footer1.xml><?xml version="1.0" encoding="utf-8"?>
-<w:ftr xmlns:wpc="http://schemas.microsoft.com/office/word/2010/wordprocessingCanvas" xmlns:cx="http://schemas.microsoft.com/office/drawing/2014/chartex" xmlns:cx1="http://schemas.microsoft.com/office/drawing/2015/9/8/chartex" xmlns:cx2="http://schemas.microsoft.com/office/drawing/2015/10/21/chartex" xmlns:cx3="http://schemas.microsoft.com/office/drawing/2016/5/9/chartex" xmlns:cx4="http://schemas.microsoft.com/office/drawing/2016/5/10/chartex" xmlns:cx5="http://schemas.microsoft.com/office/drawing/2016/5/11/chartex" xmlns:cx6="http://schemas.microsoft.com/office/drawing/2016/5/12/chartex" xmlns:cx7="http://schemas.microsoft.com/office/drawing/2016/5/13/chartex" xmlns:cx8="http://schemas.microsoft.com/office/drawing/2016/5/14/chartex" xmlns:mc="http://schemas.openxmlformats.org/markup-compatibility/2006" xmlns:aink="http://schemas.microsoft.com/office/drawing/2016/ink" xmlns:am3d="http://schemas.microsoft.com/office/drawing/2017/model3d" xmlns:o="urn:schemas-microsoft-com:office:office" xmlns:oel="http://schemas.microsoft.com/office/2019/extlst" xmlns:r="http://schemas.openxmlformats.org/officeDocument/2006/relationships" xmlns:m="http://schemas.openxmlformats.org/officeDocument/2006/math" xmlns:v="urn:schemas-microsoft-com:vml" xmlns:wp14="http://schemas.microsoft.com/office/word/2010/wordprocessingDrawing" xmlns:wp="http://schemas.openxmlformats.org/drawingml/2006/wordprocessingDrawing" xmlns:w10="urn:schemas-microsoft-com:office:word" xmlns:w="http://schemas.openxmlformats.org/wordprocessingml/2006/main" xmlns:w14="http://schemas.microsoft.com/office/word/2010/wordml" xmlns:w15="http://schemas.microsoft.com/office/word/2012/wordml" xmlns:w16cex="http://schemas.microsoft.com/office/word/2018/wordml/cex" xmlns:w16cid="http://schemas.microsoft.com/office/word/2016/wordml/cid" xmlns:w16="http://schemas.microsoft.com/office/word/2018/wordml" xmlns:w16du="http://schemas.microsoft.com/office/word/2023/wordml/word16du" xmlns:w16sdtdh="http://schemas.microsoft.com/office/word/2020/wordml/sdtdatahash" xmlns:w16se="http://schemas.microsoft.com/office/word/2015/wordml/symex" xmlns:wpg="http://schemas.microsoft.com/office/word/2010/wordprocessingGroup" xmlns:wpi="http://schemas.microsoft.com/office/word/2010/wordprocessingInk" xmlns:wne="http://schemas.microsoft.com/office/word/2006/wordml" xmlns:wps="http://schemas.microsoft.com/office/word/2010/wordprocessingShape" mc:Ignorable="w14 w15 w16se w16cid w16 w16cex w16sdtdh w16du wp14">
+<w:ftr xmlns:wpc="http://schemas.microsoft.com/office/word/2010/wordprocessingCanvas" xmlns:cx="http://schemas.microsoft.com/office/drawing/2014/chartex" xmlns:cx1="http://schemas.microsoft.com/office/drawing/2015/9/8/chartex" xmlns:cx2="http://schemas.microsoft.com/office/drawing/2015/10/21/chartex" xmlns:cx3="http://schemas.microsoft.com/office/drawing/2016/5/9/chartex" xmlns:cx4="http://schemas.microsoft.com/office/drawing/2016/5/10/chartex" xmlns:cx5="http://schemas.microsoft.com/office/drawing/2016/5/11/chartex" xmlns:cx6="http://schemas.microsoft.com/office/drawing/2016/5/12/chartex" xmlns:cx7="http://schemas.microsoft.com/office/drawing/2016/5/13/chartex" xmlns:cx8="http://schemas.microsoft.com/office/drawing/2016/5/14/chartex" xmlns:mc="http://schemas.openxmlformats.org/markup-compatibility/2006" xmlns:aink="http://schemas.microsoft.com/office/drawing/2016/ink" xmlns:am3d="http://schemas.microsoft.com/office/drawing/2017/model3d" xmlns:o="urn:schemas-microsoft-com:office:office" xmlns:oel="http://schemas.microsoft.com/office/2019/extlst" xmlns:r="http://schemas.openxmlformats.org/officeDocument/2006/relationships" xmlns:m="http://schemas.openxmlformats.org/officeDocument/2006/math" xmlns:v="urn:schemas-microsoft-com:vml" xmlns:wp14="http://schemas.microsoft.com/office/word/2010/wordprocessingDrawing" xmlns:wp="http://schemas.openxmlformats.org/drawingml/2006/wordprocessingDrawing" xmlns:w10="urn:schemas-microsoft-com:office:word" xmlns:w="http://schemas.openxmlformats.org/wordprocessingml/2006/main" xmlns:w14="http://schemas.microsoft.com/office/word/2010/wordml" xmlns:w15="http://schemas.microsoft.com/office/word/2012/wordml" xmlns:w16cex="http://schemas.microsoft.com/office/word/2018/wordml/cex" xmlns:w16cid="http://schemas.microsoft.com/office/word/2016/wordml/cid" xmlns:w16="http://schemas.microsoft.com/office/word/2018/wordml" xmlns:w16du="http://schemas.microsoft.com/office/word/2023/wordml/word16du" xmlns:w16sdtdh="http://schemas.microsoft.com/office/word/2020/wordml/sdtdatahash" xmlns:w16sdtfl="http://schemas.microsoft.com/office/word/2024/wordml/sdtformatlock" xmlns:w16se="http://schemas.microsoft.com/office/word/2015/wordml/symex" xmlns:wpg="http://schemas.microsoft.com/office/word/2010/wordprocessingGroup" xmlns:wpi="http://schemas.microsoft.com/office/word/2010/wordprocessingInk" xmlns:wne="http://schemas.microsoft.com/office/word/2006/wordml" xmlns:wps="http://schemas.microsoft.com/office/word/2010/wordprocessingShape" mc:Ignorable="w14 w15 w16se w16cid w16 w16cex w16sdtdh w16sdtfl w16du wp14">
   <w:sdt>
     <w:sdtPr>
       <w:id w:val="-799988121"/>
@@ -2148,7 +2147,7 @@
 </file>
 
 <file path=word/footer2.xml><?xml version="1.0" encoding="utf-8"?>
-<w:ftr xmlns:wpc="http://schemas.microsoft.com/office/word/2010/wordprocessingCanvas" xmlns:cx="http://schemas.microsoft.com/office/drawing/2014/chartex" xmlns:cx1="http://schemas.microsoft.com/office/drawing/2015/9/8/chartex" xmlns:cx2="http://schemas.microsoft.com/office/drawing/2015/10/21/chartex" xmlns:cx3="http://schemas.microsoft.com/office/drawing/2016/5/9/chartex" xmlns:cx4="http://schemas.microsoft.com/office/drawing/2016/5/10/chartex" xmlns:cx5="http://schemas.microsoft.com/office/drawing/2016/5/11/chartex" xmlns:cx6="http://schemas.microsoft.com/office/drawing/2016/5/12/chartex" xmlns:cx7="http://schemas.microsoft.com/office/drawing/2016/5/13/chartex" xmlns:cx8="http://schemas.microsoft.com/office/drawing/2016/5/14/chartex" xmlns:mc="http://schemas.openxmlformats.org/markup-compatibility/2006" xmlns:aink="http://schemas.microsoft.com/office/drawing/2016/ink" xmlns:am3d="http://schemas.microsoft.com/office/drawing/2017/model3d" xmlns:o="urn:schemas-microsoft-com:office:office" xmlns:oel="http://schemas.microsoft.com/office/2019/extlst" xmlns:r="http://schemas.openxmlformats.org/officeDocument/2006/relationships" xmlns:m="http://schemas.openxmlformats.org/officeDocument/2006/math" xmlns:v="urn:schemas-microsoft-com:vml" xmlns:wp14="http://schemas.microsoft.com/office/word/2010/wordprocessingDrawing" xmlns:wp="http://schemas.openxmlformats.org/drawingml/2006/wordprocessingDrawing" xmlns:w10="urn:schemas-microsoft-com:office:word" xmlns:w="http://schemas.openxmlformats.org/wordprocessingml/2006/main" xmlns:w14="http://schemas.microsoft.com/office/word/2010/wordml" xmlns:w15="http://schemas.microsoft.com/office/word/2012/wordml" xmlns:w16cex="http://schemas.microsoft.com/office/word/2018/wordml/cex" xmlns:w16cid="http://schemas.microsoft.com/office/word/2016/wordml/cid" xmlns:w16="http://schemas.microsoft.com/office/word/2018/wordml" xmlns:w16du="http://schemas.microsoft.com/office/word/2023/wordml/word16du" xmlns:w16sdtdh="http://schemas.microsoft.com/office/word/2020/wordml/sdtdatahash" xmlns:w16se="http://schemas.microsoft.com/office/word/2015/wordml/symex" xmlns:wpg="http://schemas.microsoft.com/office/word/2010/wordprocessingGroup" xmlns:wpi="http://schemas.microsoft.com/office/word/2010/wordprocessingInk" xmlns:wne="http://schemas.microsoft.com/office/word/2006/wordml" xmlns:wps="http://schemas.microsoft.com/office/word/2010/wordprocessingShape" mc:Ignorable="w14 w15 w16se w16cid w16 w16cex w16sdtdh w16du wp14">
+<w:ftr xmlns:wpc="http://schemas.microsoft.com/office/word/2010/wordprocessingCanvas" xmlns:cx="http://schemas.microsoft.com/office/drawing/2014/chartex" xmlns:cx1="http://schemas.microsoft.com/office/drawing/2015/9/8/chartex" xmlns:cx2="http://schemas.microsoft.com/office/drawing/2015/10/21/chartex" xmlns:cx3="http://schemas.microsoft.com/office/drawing/2016/5/9/chartex" xmlns:cx4="http://schemas.microsoft.com/office/drawing/2016/5/10/chartex" xmlns:cx5="http://schemas.microsoft.com/office/drawing/2016/5/11/chartex" xmlns:cx6="http://schemas.microsoft.com/office/drawing/2016/5/12/chartex" xmlns:cx7="http://schemas.microsoft.com/office/drawing/2016/5/13/chartex" xmlns:cx8="http://schemas.microsoft.com/office/drawing/2016/5/14/chartex" xmlns:mc="http://schemas.openxmlformats.org/markup-compatibility/2006" xmlns:aink="http://schemas.microsoft.com/office/drawing/2016/ink" xmlns:am3d="http://schemas.microsoft.com/office/drawing/2017/model3d" xmlns:o="urn:schemas-microsoft-com:office:office" xmlns:oel="http://schemas.microsoft.com/office/2019/extlst" xmlns:r="http://schemas.openxmlformats.org/officeDocument/2006/relationships" xmlns:m="http://schemas.openxmlformats.org/officeDocument/2006/math" xmlns:v="urn:schemas-microsoft-com:vml" xmlns:wp14="http://schemas.microsoft.com/office/word/2010/wordprocessingDrawing" xmlns:wp="http://schemas.openxmlformats.org/drawingml/2006/wordprocessingDrawing" xmlns:w10="urn:schemas-microsoft-com:office:word" xmlns:w="http://schemas.openxmlformats.org/wordprocessingml/2006/main" xmlns:w14="http://schemas.microsoft.com/office/word/2010/wordml" xmlns:w15="http://schemas.microsoft.com/office/word/2012/wordml" xmlns:w16cex="http://schemas.microsoft.com/office/word/2018/wordml/cex" xmlns:w16cid="http://schemas.microsoft.com/office/word/2016/wordml/cid" xmlns:w16="http://schemas.microsoft.com/office/word/2018/wordml" xmlns:w16du="http://schemas.microsoft.com/office/word/2023/wordml/word16du" xmlns:w16sdtdh="http://schemas.microsoft.com/office/word/2020/wordml/sdtdatahash" xmlns:w16sdtfl="http://schemas.microsoft.com/office/word/2024/wordml/sdtformatlock" xmlns:w16se="http://schemas.microsoft.com/office/word/2015/wordml/symex" xmlns:wpg="http://schemas.microsoft.com/office/word/2010/wordprocessingGroup" xmlns:wpi="http://schemas.microsoft.com/office/word/2010/wordprocessingInk" xmlns:wne="http://schemas.microsoft.com/office/word/2006/wordml" xmlns:wps="http://schemas.microsoft.com/office/word/2010/wordprocessingShape" mc:Ignorable="w14 w15 w16se w16cid w16 w16cex w16sdtdh w16sdtfl w16du wp14">
   <w:p>
     <w:pPr>
       <w:pStyle w:val="Footer"/>
@@ -2159,10 +2158,10 @@
         <w:noProof/>
       </w:rPr>
       <w:drawing>
-        <wp:inline distT="0" distB="0" distL="0" distR="0" wp14:anchorId="4154C121" wp14:editId="74506F2C">
-          <wp:extent cx="6887821" cy="694944"/>
+        <wp:inline distT="0" distB="0" distL="0" distR="0" wp14:anchorId="6B0DEEB9" wp14:editId="6315C574">
+          <wp:extent cx="6876000" cy="816085"/>
           <wp:effectExtent l="0" t="0" r="0" b="0"/>
-          <wp:docPr id="3" name="Picture 3" descr="A black and purple logo&#10;&#10;Description automatically generated"/>
+          <wp:docPr id="28347762" name="Picture 1"/>
           <wp:cNvGraphicFramePr>
             <a:graphicFrameLocks xmlns:a="http://schemas.openxmlformats.org/drawingml/2006/main" noChangeAspect="1"/>
           </wp:cNvGraphicFramePr>
@@ -2170,36 +2169,29 @@
             <a:graphicData uri="http://schemas.openxmlformats.org/drawingml/2006/picture">
               <pic:pic xmlns:pic="http://schemas.openxmlformats.org/drawingml/2006/picture">
                 <pic:nvPicPr>
-                  <pic:cNvPr id="4" name="Picture 3" descr="A black and purple logo&#10;&#10;Description automatically generated"/>
+                  <pic:cNvPr id="28347762" name="Picture 28347762"/>
                   <pic:cNvPicPr/>
                 </pic:nvPicPr>
-                <pic:blipFill rotWithShape="1">
-                  <a:blip r:embed="rId1" cstate="print">
+                <pic:blipFill>
+                  <a:blip r:embed="rId1">
                     <a:extLst>
                       <a:ext uri="{28A0092B-C50C-407E-A947-70E740481C1C}">
                         <a14:useLocalDpi xmlns:a14="http://schemas.microsoft.com/office/drawing/2010/main" val="0"/>
                       </a:ext>
                     </a:extLst>
                   </a:blip>
-                  <a:srcRect l="2293" t="18005" r="2762" b="14674"/>
-                  <a:stretch/>
+                  <a:stretch>
+                    <a:fillRect/>
+                  </a:stretch>
                 </pic:blipFill>
-                <pic:spPr bwMode="auto">
+                <pic:spPr>
                   <a:xfrm>
                     <a:off x="0" y="0"/>
-                    <a:ext cx="6887821" cy="694944"/>
+                    <a:ext cx="6876000" cy="816085"/>
                   </a:xfrm>
                   <a:prstGeom prst="rect">
                     <a:avLst/>
                   </a:prstGeom>
-                  <a:ln>
-                    <a:noFill/>
-                  </a:ln>
-                  <a:extLst>
-                    <a:ext uri="{53640926-AAD7-44D8-BBD7-CCE9431645EC}">
-                      <a14:shadowObscured xmlns:a14="http://schemas.microsoft.com/office/drawing/2010/main"/>
-                    </a:ext>
-                  </a:extLst>
                 </pic:spPr>
               </pic:pic>
             </a:graphicData>
@@ -2208,17 +2200,11 @@
       </w:drawing>
     </w:r>
   </w:p>
-  <w:p>
-    <w:pPr>
-      <w:pStyle w:val="Footer"/>
-      <w:ind w:left="-576"/>
-    </w:pPr>
-  </w:p>
 </w:ftr>
 </file>
 
 <file path=word/footnotes.xml><?xml version="1.0" encoding="utf-8"?>
-<w:footnotes xmlns:wpc="http://schemas.microsoft.com/office/word/2010/wordprocessingCanvas" xmlns:cx="http://schemas.microsoft.com/office/drawing/2014/chartex" xmlns:cx1="http://schemas.microsoft.com/office/drawing/2015/9/8/chartex" xmlns:cx2="http://schemas.microsoft.com/office/drawing/2015/10/21/chartex" xmlns:cx3="http://schemas.microsoft.com/office/drawing/2016/5/9/chartex" xmlns:cx4="http://schemas.microsoft.com/office/drawing/2016/5/10/chartex" xmlns:cx5="http://schemas.microsoft.com/office/drawing/2016/5/11/chartex" xmlns:cx6="http://schemas.microsoft.com/office/drawing/2016/5/12/chartex" xmlns:cx7="http://schemas.microsoft.com/office/drawing/2016/5/13/chartex" xmlns:cx8="http://schemas.microsoft.com/office/drawing/2016/5/14/chartex" xmlns:mc="http://schemas.openxmlformats.org/markup-compatibility/2006" xmlns:aink="http://schemas.microsoft.com/office/drawing/2016/ink" xmlns:am3d="http://schemas.microsoft.com/office/drawing/2017/model3d" xmlns:o="urn:schemas-microsoft-com:office:office" xmlns:oel="http://schemas.microsoft.com/office/2019/extlst" xmlns:r="http://schemas.openxmlformats.org/officeDocument/2006/relationships" xmlns:m="http://schemas.openxmlformats.org/officeDocument/2006/math" xmlns:v="urn:schemas-microsoft-com:vml" xmlns:wp14="http://schemas.microsoft.com/office/word/2010/wordprocessingDrawing" xmlns:wp="http://schemas.openxmlformats.org/drawingml/2006/wordprocessingDrawing" xmlns:w10="urn:schemas-microsoft-com:office:word" xmlns:w="http://schemas.openxmlformats.org/wordprocessingml/2006/main" xmlns:w14="http://schemas.microsoft.com/office/word/2010/wordml" xmlns:w15="http://schemas.microsoft.com/office/word/2012/wordml" xmlns:w16cex="http://schemas.microsoft.com/office/word/2018/wordml/cex" xmlns:w16cid="http://schemas.microsoft.com/office/word/2016/wordml/cid" xmlns:w16="http://schemas.microsoft.com/office/word/2018/wordml" xmlns:w16du="http://schemas.microsoft.com/office/word/2023/wordml/word16du" xmlns:w16sdtdh="http://schemas.microsoft.com/office/word/2020/wordml/sdtdatahash" xmlns:w16se="http://schemas.microsoft.com/office/word/2015/wordml/symex" xmlns:wpg="http://schemas.microsoft.com/office/word/2010/wordprocessingGroup" xmlns:wpi="http://schemas.microsoft.com/office/word/2010/wordprocessingInk" xmlns:wne="http://schemas.microsoft.com/office/word/2006/wordml" xmlns:wps="http://schemas.microsoft.com/office/word/2010/wordprocessingShape" mc:Ignorable="w14 w15 w16se w16cid w16 w16cex w16sdtdh w16du wp14">
+<w:footnotes xmlns:wpc="http://schemas.microsoft.com/office/word/2010/wordprocessingCanvas" xmlns:cx="http://schemas.microsoft.com/office/drawing/2014/chartex" xmlns:cx1="http://schemas.microsoft.com/office/drawing/2015/9/8/chartex" xmlns:cx2="http://schemas.microsoft.com/office/drawing/2015/10/21/chartex" xmlns:cx3="http://schemas.microsoft.com/office/drawing/2016/5/9/chartex" xmlns:cx4="http://schemas.microsoft.com/office/drawing/2016/5/10/chartex" xmlns:cx5="http://schemas.microsoft.com/office/drawing/2016/5/11/chartex" xmlns:cx6="http://schemas.microsoft.com/office/drawing/2016/5/12/chartex" xmlns:cx7="http://schemas.microsoft.com/office/drawing/2016/5/13/chartex" xmlns:cx8="http://schemas.microsoft.com/office/drawing/2016/5/14/chartex" xmlns:mc="http://schemas.openxmlformats.org/markup-compatibility/2006" xmlns:aink="http://schemas.microsoft.com/office/drawing/2016/ink" xmlns:am3d="http://schemas.microsoft.com/office/drawing/2017/model3d" xmlns:o="urn:schemas-microsoft-com:office:office" xmlns:oel="http://schemas.microsoft.com/office/2019/extlst" xmlns:r="http://schemas.openxmlformats.org/officeDocument/2006/relationships" xmlns:m="http://schemas.openxmlformats.org/officeDocument/2006/math" xmlns:v="urn:schemas-microsoft-com:vml" xmlns:wp14="http://schemas.microsoft.com/office/word/2010/wordprocessingDrawing" xmlns:wp="http://schemas.openxmlformats.org/drawingml/2006/wordprocessingDrawing" xmlns:w10="urn:schemas-microsoft-com:office:word" xmlns:w="http://schemas.openxmlformats.org/wordprocessingml/2006/main" xmlns:w14="http://schemas.microsoft.com/office/word/2010/wordml" xmlns:w15="http://schemas.microsoft.com/office/word/2012/wordml" xmlns:w16cex="http://schemas.microsoft.com/office/word/2018/wordml/cex" xmlns:w16cid="http://schemas.microsoft.com/office/word/2016/wordml/cid" xmlns:w16="http://schemas.microsoft.com/office/word/2018/wordml" xmlns:w16du="http://schemas.microsoft.com/office/word/2023/wordml/word16du" xmlns:w16sdtdh="http://schemas.microsoft.com/office/word/2020/wordml/sdtdatahash" xmlns:w16sdtfl="http://schemas.microsoft.com/office/word/2024/wordml/sdtformatlock" xmlns:w16se="http://schemas.microsoft.com/office/word/2015/wordml/symex" xmlns:wpg="http://schemas.microsoft.com/office/word/2010/wordprocessingGroup" xmlns:wpi="http://schemas.microsoft.com/office/word/2010/wordprocessingInk" xmlns:wne="http://schemas.microsoft.com/office/word/2006/wordml" xmlns:wps="http://schemas.microsoft.com/office/word/2010/wordprocessingShape" mc:Ignorable="w14 w15 w16se w16cid w16 w16cex w16sdtdh w16sdtfl w16du wp14">
   <w:footnote w:type="separator" w:id="-1">
     <w:p>
       <w:r>
@@ -2253,7 +2239,7 @@
 </file>
 
 <file path=word/header1.xml><?xml version="1.0" encoding="utf-8"?>
-<w:hdr xmlns:wpc="http://schemas.microsoft.com/office/word/2010/wordprocessingCanvas" xmlns:cx="http://schemas.microsoft.com/office/drawing/2014/chartex" xmlns:cx1="http://schemas.microsoft.com/office/drawing/2015/9/8/chartex" xmlns:cx2="http://schemas.microsoft.com/office/drawing/2015/10/21/chartex" xmlns:cx3="http://schemas.microsoft.com/office/drawing/2016/5/9/chartex" xmlns:cx4="http://schemas.microsoft.com/office/drawing/2016/5/10/chartex" xmlns:cx5="http://schemas.microsoft.com/office/drawing/2016/5/11/chartex" xmlns:cx6="http://schemas.microsoft.com/office/drawing/2016/5/12/chartex" xmlns:cx7="http://schemas.microsoft.com/office/drawing/2016/5/13/chartex" xmlns:cx8="http://schemas.microsoft.com/office/drawing/2016/5/14/chartex" xmlns:mc="http://schemas.openxmlformats.org/markup-compatibility/2006" xmlns:aink="http://schemas.microsoft.com/office/drawing/2016/ink" xmlns:am3d="http://schemas.microsoft.com/office/drawing/2017/model3d" xmlns:o="urn:schemas-microsoft-com:office:office" xmlns:oel="http://schemas.microsoft.com/office/2019/extlst" xmlns:r="http://schemas.openxmlformats.org/officeDocument/2006/relationships" xmlns:m="http://schemas.openxmlformats.org/officeDocument/2006/math" xmlns:v="urn:schemas-microsoft-com:vml" xmlns:wp14="http://schemas.microsoft.com/office/word/2010/wordprocessingDrawing" xmlns:wp="http://schemas.openxmlformats.org/drawingml/2006/wordprocessingDrawing" xmlns:w10="urn:schemas-microsoft-com:office:word" xmlns:w="http://schemas.openxmlformats.org/wordprocessingml/2006/main" xmlns:w14="http://schemas.microsoft.com/office/word/2010/wordml" xmlns:w15="http://schemas.microsoft.com/office/word/2012/wordml" xmlns:w16cex="http://schemas.microsoft.com/office/word/2018/wordml/cex" xmlns:w16cid="http://schemas.microsoft.com/office/word/2016/wordml/cid" xmlns:w16="http://schemas.microsoft.com/office/word/2018/wordml" xmlns:w16du="http://schemas.microsoft.com/office/word/2023/wordml/word16du" xmlns:w16sdtdh="http://schemas.microsoft.com/office/word/2020/wordml/sdtdatahash" xmlns:w16se="http://schemas.microsoft.com/office/word/2015/wordml/symex" xmlns:wpg="http://schemas.microsoft.com/office/word/2010/wordprocessingGroup" xmlns:wpi="http://schemas.microsoft.com/office/word/2010/wordprocessingInk" xmlns:wne="http://schemas.microsoft.com/office/word/2006/wordml" xmlns:wps="http://schemas.microsoft.com/office/word/2010/wordprocessingShape" mc:Ignorable="w14 w15 w16se w16cid w16 w16cex w16sdtdh w16du wp14">
+<w:hdr xmlns:wpc="http://schemas.microsoft.com/office/word/2010/wordprocessingCanvas" xmlns:cx="http://schemas.microsoft.com/office/drawing/2014/chartex" xmlns:cx1="http://schemas.microsoft.com/office/drawing/2015/9/8/chartex" xmlns:cx2="http://schemas.microsoft.com/office/drawing/2015/10/21/chartex" xmlns:cx3="http://schemas.microsoft.com/office/drawing/2016/5/9/chartex" xmlns:cx4="http://schemas.microsoft.com/office/drawing/2016/5/10/chartex" xmlns:cx5="http://schemas.microsoft.com/office/drawing/2016/5/11/chartex" xmlns:cx6="http://schemas.microsoft.com/office/drawing/2016/5/12/chartex" xmlns:cx7="http://schemas.microsoft.com/office/drawing/2016/5/13/chartex" xmlns:cx8="http://schemas.microsoft.com/office/drawing/2016/5/14/chartex" xmlns:mc="http://schemas.openxmlformats.org/markup-compatibility/2006" xmlns:aink="http://schemas.microsoft.com/office/drawing/2016/ink" xmlns:am3d="http://schemas.microsoft.com/office/drawing/2017/model3d" xmlns:o="urn:schemas-microsoft-com:office:office" xmlns:oel="http://schemas.microsoft.com/office/2019/extlst" xmlns:r="http://schemas.openxmlformats.org/officeDocument/2006/relationships" xmlns:m="http://schemas.openxmlformats.org/officeDocument/2006/math" xmlns:v="urn:schemas-microsoft-com:vml" xmlns:wp14="http://schemas.microsoft.com/office/word/2010/wordprocessingDrawing" xmlns:wp="http://schemas.openxmlformats.org/drawingml/2006/wordprocessingDrawing" xmlns:w10="urn:schemas-microsoft-com:office:word" xmlns:w="http://schemas.openxmlformats.org/wordprocessingml/2006/main" xmlns:w14="http://schemas.microsoft.com/office/word/2010/wordml" xmlns:w15="http://schemas.microsoft.com/office/word/2012/wordml" xmlns:w16cex="http://schemas.microsoft.com/office/word/2018/wordml/cex" xmlns:w16cid="http://schemas.microsoft.com/office/word/2016/wordml/cid" xmlns:w16="http://schemas.microsoft.com/office/word/2018/wordml" xmlns:w16du="http://schemas.microsoft.com/office/word/2023/wordml/word16du" xmlns:w16sdtdh="http://schemas.microsoft.com/office/word/2020/wordml/sdtdatahash" xmlns:w16sdtfl="http://schemas.microsoft.com/office/word/2024/wordml/sdtformatlock" xmlns:w16se="http://schemas.microsoft.com/office/word/2015/wordml/symex" xmlns:wpg="http://schemas.microsoft.com/office/word/2010/wordprocessingGroup" xmlns:wpi="http://schemas.microsoft.com/office/word/2010/wordprocessingInk" xmlns:wne="http://schemas.microsoft.com/office/word/2006/wordml" xmlns:wps="http://schemas.microsoft.com/office/word/2010/wordprocessingShape" mc:Ignorable="w14 w15 w16se w16cid w16 w16cex w16sdtdh w16sdtfl w16du wp14">
   <w:p>
     <w:pPr>
       <w:pStyle w:val="Header"/>
@@ -2291,7 +2277,7 @@
 </file>
 
 <file path=word/header2.xml><?xml version="1.0" encoding="utf-8"?>
-<w:hdr xmlns:wpc="http://schemas.microsoft.com/office/word/2010/wordprocessingCanvas" xmlns:cx="http://schemas.microsoft.com/office/drawing/2014/chartex" xmlns:cx1="http://schemas.microsoft.com/office/drawing/2015/9/8/chartex" xmlns:cx2="http://schemas.microsoft.com/office/drawing/2015/10/21/chartex" xmlns:cx3="http://schemas.microsoft.com/office/drawing/2016/5/9/chartex" xmlns:cx4="http://schemas.microsoft.com/office/drawing/2016/5/10/chartex" xmlns:cx5="http://schemas.microsoft.com/office/drawing/2016/5/11/chartex" xmlns:cx6="http://schemas.microsoft.com/office/drawing/2016/5/12/chartex" xmlns:cx7="http://schemas.microsoft.com/office/drawing/2016/5/13/chartex" xmlns:cx8="http://schemas.microsoft.com/office/drawing/2016/5/14/chartex" xmlns:mc="http://schemas.openxmlformats.org/markup-compatibility/2006" xmlns:aink="http://schemas.microsoft.com/office/drawing/2016/ink" xmlns:am3d="http://schemas.microsoft.com/office/drawing/2017/model3d" xmlns:o="urn:schemas-microsoft-com:office:office" xmlns:oel="http://schemas.microsoft.com/office/2019/extlst" xmlns:r="http://schemas.openxmlformats.org/officeDocument/2006/relationships" xmlns:m="http://schemas.openxmlformats.org/officeDocument/2006/math" xmlns:v="urn:schemas-microsoft-com:vml" xmlns:wp14="http://schemas.microsoft.com/office/word/2010/wordprocessingDrawing" xmlns:wp="http://schemas.openxmlformats.org/drawingml/2006/wordprocessingDrawing" xmlns:w10="urn:schemas-microsoft-com:office:word" xmlns:w="http://schemas.openxmlformats.org/wordprocessingml/2006/main" xmlns:w14="http://schemas.microsoft.com/office/word/2010/wordml" xmlns:w15="http://schemas.microsoft.com/office/word/2012/wordml" xmlns:w16cex="http://schemas.microsoft.com/office/word/2018/wordml/cex" xmlns:w16cid="http://schemas.microsoft.com/office/word/2016/wordml/cid" xmlns:w16="http://schemas.microsoft.com/office/word/2018/wordml" xmlns:w16du="http://schemas.microsoft.com/office/word/2023/wordml/word16du" xmlns:w16sdtdh="http://schemas.microsoft.com/office/word/2020/wordml/sdtdatahash" xmlns:w16se="http://schemas.microsoft.com/office/word/2015/wordml/symex" xmlns:wpg="http://schemas.microsoft.com/office/word/2010/wordprocessingGroup" xmlns:wpi="http://schemas.microsoft.com/office/word/2010/wordprocessingInk" xmlns:wne="http://schemas.microsoft.com/office/word/2006/wordml" xmlns:wps="http://schemas.microsoft.com/office/word/2010/wordprocessingShape" mc:Ignorable="w14 w15 w16se w16cid w16 w16cex w16sdtdh w16du wp14">
+<w:hdr xmlns:wpc="http://schemas.microsoft.com/office/word/2010/wordprocessingCanvas" xmlns:cx="http://schemas.microsoft.com/office/drawing/2014/chartex" xmlns:cx1="http://schemas.microsoft.com/office/drawing/2015/9/8/chartex" xmlns:cx2="http://schemas.microsoft.com/office/drawing/2015/10/21/chartex" xmlns:cx3="http://schemas.microsoft.com/office/drawing/2016/5/9/chartex" xmlns:cx4="http://schemas.microsoft.com/office/drawing/2016/5/10/chartex" xmlns:cx5="http://schemas.microsoft.com/office/drawing/2016/5/11/chartex" xmlns:cx6="http://schemas.microsoft.com/office/drawing/2016/5/12/chartex" xmlns:cx7="http://schemas.microsoft.com/office/drawing/2016/5/13/chartex" xmlns:cx8="http://schemas.microsoft.com/office/drawing/2016/5/14/chartex" xmlns:mc="http://schemas.openxmlformats.org/markup-compatibility/2006" xmlns:aink="http://schemas.microsoft.com/office/drawing/2016/ink" xmlns:am3d="http://schemas.microsoft.com/office/drawing/2017/model3d" xmlns:o="urn:schemas-microsoft-com:office:office" xmlns:oel="http://schemas.microsoft.com/office/2019/extlst" xmlns:r="http://schemas.openxmlformats.org/officeDocument/2006/relationships" xmlns:m="http://schemas.openxmlformats.org/officeDocument/2006/math" xmlns:v="urn:schemas-microsoft-com:vml" xmlns:wp14="http://schemas.microsoft.com/office/word/2010/wordprocessingDrawing" xmlns:wp="http://schemas.openxmlformats.org/drawingml/2006/wordprocessingDrawing" xmlns:w10="urn:schemas-microsoft-com:office:word" xmlns:w="http://schemas.openxmlformats.org/wordprocessingml/2006/main" xmlns:w14="http://schemas.microsoft.com/office/word/2010/wordml" xmlns:w15="http://schemas.microsoft.com/office/word/2012/wordml" xmlns:w16cex="http://schemas.microsoft.com/office/word/2018/wordml/cex" xmlns:w16cid="http://schemas.microsoft.com/office/word/2016/wordml/cid" xmlns:w16="http://schemas.microsoft.com/office/word/2018/wordml" xmlns:w16du="http://schemas.microsoft.com/office/word/2023/wordml/word16du" xmlns:w16sdtdh="http://schemas.microsoft.com/office/word/2020/wordml/sdtdatahash" xmlns:w16sdtfl="http://schemas.microsoft.com/office/word/2024/wordml/sdtformatlock" xmlns:w16se="http://schemas.microsoft.com/office/word/2015/wordml/symex" xmlns:wpg="http://schemas.microsoft.com/office/word/2010/wordprocessingGroup" xmlns:wpi="http://schemas.microsoft.com/office/word/2010/wordprocessingInk" xmlns:wne="http://schemas.microsoft.com/office/word/2006/wordml" xmlns:wps="http://schemas.microsoft.com/office/word/2010/wordprocessingShape" mc:Ignorable="w14 w15 w16se w16cid w16 w16cex w16sdtdh w16sdtfl w16du wp14">
   <w:p>
     <w:pPr>
       <w:pStyle w:val="Header"/>
@@ -2363,7 +2349,7 @@
 </file>
 
 <file path=word/numbering.xml><?xml version="1.0" encoding="utf-8"?>
-<w:numbering xmlns:wpc="http://schemas.microsoft.com/office/word/2010/wordprocessingCanvas" xmlns:cx="http://schemas.microsoft.com/office/drawing/2014/chartex" xmlns:cx1="http://schemas.microsoft.com/office/drawing/2015/9/8/chartex" xmlns:cx2="http://schemas.microsoft.com/office/drawing/2015/10/21/chartex" xmlns:cx3="http://schemas.microsoft.com/office/drawing/2016/5/9/chartex" xmlns:cx4="http://schemas.microsoft.com/office/drawing/2016/5/10/chartex" xmlns:cx5="http://schemas.microsoft.com/office/drawing/2016/5/11/chartex" xmlns:cx6="http://schemas.microsoft.com/office/drawing/2016/5/12/chartex" xmlns:cx7="http://schemas.microsoft.com/office/drawing/2016/5/13/chartex" xmlns:cx8="http://schemas.microsoft.com/office/drawing/2016/5/14/chartex" xmlns:mc="http://schemas.openxmlformats.org/markup-compatibility/2006" xmlns:aink="http://schemas.microsoft.com/office/drawing/2016/ink" xmlns:am3d="http://schemas.microsoft.com/office/drawing/2017/model3d" xmlns:o="urn:schemas-microsoft-com:office:office" xmlns:oel="http://schemas.microsoft.com/office/2019/extlst" xmlns:r="http://schemas.openxmlformats.org/officeDocument/2006/relationships" xmlns:m="http://schemas.openxmlformats.org/officeDocument/2006/math" xmlns:v="urn:schemas-microsoft-com:vml" xmlns:wp14="http://schemas.microsoft.com/office/word/2010/wordprocessingDrawing" xmlns:wp="http://schemas.openxmlformats.org/drawingml/2006/wordprocessingDrawing" xmlns:w10="urn:schemas-microsoft-com:office:word" xmlns:w="http://schemas.openxmlformats.org/wordprocessingml/2006/main" xmlns:w14="http://schemas.microsoft.com/office/word/2010/wordml" xmlns:w15="http://schemas.microsoft.com/office/word/2012/wordml" xmlns:w16cex="http://schemas.microsoft.com/office/word/2018/wordml/cex" xmlns:w16cid="http://schemas.microsoft.com/office/word/2016/wordml/cid" xmlns:w16="http://schemas.microsoft.com/office/word/2018/wordml" xmlns:w16du="http://schemas.microsoft.com/office/word/2023/wordml/word16du" xmlns:w16sdtdh="http://schemas.microsoft.com/office/word/2020/wordml/sdtdatahash" xmlns:w16se="http://schemas.microsoft.com/office/word/2015/wordml/symex" xmlns:wpg="http://schemas.microsoft.com/office/word/2010/wordprocessingGroup" xmlns:wpi="http://schemas.microsoft.com/office/word/2010/wordprocessingInk" xmlns:wne="http://schemas.microsoft.com/office/word/2006/wordml" xmlns:wps="http://schemas.microsoft.com/office/word/2010/wordprocessingShape" mc:Ignorable="w14 w15 w16se w16cid w16 w16cex w16sdtdh w16du wp14">
+<w:numbering xmlns:wpc="http://schemas.microsoft.com/office/word/2010/wordprocessingCanvas" xmlns:cx="http://schemas.microsoft.com/office/drawing/2014/chartex" xmlns:cx1="http://schemas.microsoft.com/office/drawing/2015/9/8/chartex" xmlns:cx2="http://schemas.microsoft.com/office/drawing/2015/10/21/chartex" xmlns:cx3="http://schemas.microsoft.com/office/drawing/2016/5/9/chartex" xmlns:cx4="http://schemas.microsoft.com/office/drawing/2016/5/10/chartex" xmlns:cx5="http://schemas.microsoft.com/office/drawing/2016/5/11/chartex" xmlns:cx6="http://schemas.microsoft.com/office/drawing/2016/5/12/chartex" xmlns:cx7="http://schemas.microsoft.com/office/drawing/2016/5/13/chartex" xmlns:cx8="http://schemas.microsoft.com/office/drawing/2016/5/14/chartex" xmlns:mc="http://schemas.openxmlformats.org/markup-compatibility/2006" xmlns:aink="http://schemas.microsoft.com/office/drawing/2016/ink" xmlns:am3d="http://schemas.microsoft.com/office/drawing/2017/model3d" xmlns:o="urn:schemas-microsoft-com:office:office" xmlns:oel="http://schemas.microsoft.com/office/2019/extlst" xmlns:r="http://schemas.openxmlformats.org/officeDocument/2006/relationships" xmlns:m="http://schemas.openxmlformats.org/officeDocument/2006/math" xmlns:v="urn:schemas-microsoft-com:vml" xmlns:wp14="http://schemas.microsoft.com/office/word/2010/wordprocessingDrawing" xmlns:wp="http://schemas.openxmlformats.org/drawingml/2006/wordprocessingDrawing" xmlns:w10="urn:schemas-microsoft-com:office:word" xmlns:w="http://schemas.openxmlformats.org/wordprocessingml/2006/main" xmlns:w14="http://schemas.microsoft.com/office/word/2010/wordml" xmlns:w15="http://schemas.microsoft.com/office/word/2012/wordml" xmlns:w16cex="http://schemas.microsoft.com/office/word/2018/wordml/cex" xmlns:w16cid="http://schemas.microsoft.com/office/word/2016/wordml/cid" xmlns:w16="http://schemas.microsoft.com/office/word/2018/wordml" xmlns:w16du="http://schemas.microsoft.com/office/word/2023/wordml/word16du" xmlns:w16sdtdh="http://schemas.microsoft.com/office/word/2020/wordml/sdtdatahash" xmlns:w16sdtfl="http://schemas.microsoft.com/office/word/2024/wordml/sdtformatlock" xmlns:w16se="http://schemas.microsoft.com/office/word/2015/wordml/symex" xmlns:wpg="http://schemas.microsoft.com/office/word/2010/wordprocessingGroup" xmlns:wpi="http://schemas.microsoft.com/office/word/2010/wordprocessingInk" xmlns:wne="http://schemas.microsoft.com/office/word/2006/wordml" xmlns:wps="http://schemas.microsoft.com/office/word/2010/wordprocessingShape" mc:Ignorable="w14 w15 w16se w16cid w16 w16cex w16sdtdh w16sdtfl w16du wp14">
   <w:abstractNum w:abstractNumId="0" w15:restartNumberingAfterBreak="0">
     <w:nsid w:val="00002E9A"/>
     <w:multiLevelType w:val="multilevel"/>
@@ -4964,7 +4950,7 @@
 </file>
 
 <file path=word/styles.xml><?xml version="1.0" encoding="utf-8"?>
-<w:styles xmlns:mc="http://schemas.openxmlformats.org/markup-compatibility/2006" xmlns:r="http://schemas.openxmlformats.org/officeDocument/2006/relationships" xmlns:w="http://schemas.openxmlformats.org/wordprocessingml/2006/main" xmlns:w14="http://schemas.microsoft.com/office/word/2010/wordml" xmlns:w15="http://schemas.microsoft.com/office/word/2012/wordml" xmlns:w16cex="http://schemas.microsoft.com/office/word/2018/wordml/cex" xmlns:w16cid="http://schemas.microsoft.com/office/word/2016/wordml/cid" xmlns:w16="http://schemas.microsoft.com/office/word/2018/wordml" xmlns:w16du="http://schemas.microsoft.com/office/word/2023/wordml/word16du" xmlns:w16sdtdh="http://schemas.microsoft.com/office/word/2020/wordml/sdtdatahash" xmlns:w16se="http://schemas.microsoft.com/office/word/2015/wordml/symex" mc:Ignorable="w14 w15 w16se w16cid w16 w16cex w16sdtdh w16du">
+<w:styles xmlns:mc="http://schemas.openxmlformats.org/markup-compatibility/2006" xmlns:r="http://schemas.openxmlformats.org/officeDocument/2006/relationships" xmlns:w="http://schemas.openxmlformats.org/wordprocessingml/2006/main" xmlns:w14="http://schemas.microsoft.com/office/word/2010/wordml" xmlns:w15="http://schemas.microsoft.com/office/word/2012/wordml" xmlns:w16cex="http://schemas.microsoft.com/office/word/2018/wordml/cex" xmlns:w16cid="http://schemas.microsoft.com/office/word/2016/wordml/cid" xmlns:w16="http://schemas.microsoft.com/office/word/2018/wordml" xmlns:w16du="http://schemas.microsoft.com/office/word/2023/wordml/word16du" xmlns:w16sdtdh="http://schemas.microsoft.com/office/word/2020/wordml/sdtdatahash" xmlns:w16sdtfl="http://schemas.microsoft.com/office/word/2024/wordml/sdtformatlock" xmlns:w16se="http://schemas.microsoft.com/office/word/2015/wordml/symex" mc:Ignorable="w14 w15 w16se w16cid w16 w16cex w16sdtdh w16sdtfl w16du">
   <w:docDefaults>
     <w:rPrDefault>
       <w:rPr>
@@ -6423,30 +6409,6 @@
 </file>
 
 <file path=customXml/item1.xml><?xml version="1.0" encoding="utf-8"?>
-<?mso-contentType ?>
-<FormTemplates xmlns="http://schemas.microsoft.com/sharepoint/v3/contenttype/forms">
-  <Display>DocumentLibraryForm</Display>
-  <Edit>DocumentLibraryForm</Edit>
-  <New>DocumentLibraryForm</New>
-</FormTemplates>
-</file>
-
-<file path=customXml/item2.xml><?xml version="1.0" encoding="utf-8"?>
-<p:properties xmlns:p="http://schemas.microsoft.com/office/2006/metadata/properties" xmlns:xsi="http://www.w3.org/2001/XMLSchema-instance" xmlns:pc="http://schemas.microsoft.com/office/infopath/2007/PartnerControls">
-  <documentManagement>
-    <TaxCatchAll xmlns="c0a5e2f2-cbc9-444d-acb1-da3840c97b19" xsi:nil="true"/>
-    <lcf76f155ced4ddcb4097134ff3c332f xmlns="17fa7942-0d9f-40ad-9093-ce71332f67f5">
-      <Terms xmlns="http://schemas.microsoft.com/office/infopath/2007/PartnerControls"/>
-    </lcf76f155ced4ddcb4097134ff3c332f>
-  </documentManagement>
-</p:properties>
-</file>
-
-<file path=customXml/item3.xml><?xml version="1.0" encoding="utf-8"?>
-<b:Sources xmlns:b="http://schemas.openxmlformats.org/officeDocument/2006/bibliography" xmlns="http://schemas.openxmlformats.org/officeDocument/2006/bibliography" SelectedStyle="\APASixthEditionOfficeOnline.xsl" StyleName="APA" Version="6"/>
-</file>
-
-<file path=customXml/item4.xml><?xml version="1.0" encoding="utf-8"?>
 <ct:contentTypeSchema xmlns:ct="http://schemas.microsoft.com/office/2006/metadata/contentType" xmlns:ma="http://schemas.microsoft.com/office/2006/metadata/properties/metaAttributes" ct:_="" ma:_="" ma:contentTypeName="Document" ma:contentTypeID="0x010100BE37AAF0DD5F4448A506F792B732F161" ma:contentTypeVersion="15" ma:contentTypeDescription="Create a new document." ma:contentTypeScope="" ma:versionID="4f9eece326cb8525d683a1ea9e6b2db6">
   <xsd:schema xmlns:xsd="http://www.w3.org/2001/XMLSchema" xmlns:xs="http://www.w3.org/2001/XMLSchema" xmlns:p="http://schemas.microsoft.com/office/2006/metadata/properties" xmlns:ns2="17fa7942-0d9f-40ad-9093-ce71332f67f5" xmlns:ns3="c0a5e2f2-cbc9-444d-acb1-da3840c97b19" targetNamespace="http://schemas.microsoft.com/office/2006/metadata/properties" ma:root="true" ma:fieldsID="83691a1f05b251e90b3a47d11cb76344" ns2:_="" ns3:_="">
     <xsd:import namespace="17fa7942-0d9f-40ad-9093-ce71332f67f5"/>
@@ -6681,34 +6643,31 @@
 </ct:contentTypeSchema>
 </file>
 
-<file path=customXml/itemProps1.xml><?xml version="1.0" encoding="utf-8"?>
-<ds:datastoreItem xmlns:ds="http://schemas.openxmlformats.org/officeDocument/2006/customXml" ds:itemID="{5B075FEA-4E01-4107-8B62-6F06417D51EB}">
-  <ds:schemaRefs>
-    <ds:schemaRef ds:uri="http://schemas.microsoft.com/sharepoint/v3/contenttype/forms"/>
-  </ds:schemaRefs>
-</ds:datastoreItem>
+<file path=customXml/item2.xml><?xml version="1.0" encoding="utf-8"?>
+<b:Sources xmlns:b="http://schemas.openxmlformats.org/officeDocument/2006/bibliography" xmlns="http://schemas.openxmlformats.org/officeDocument/2006/bibliography" SelectedStyle="\APASixthEditionOfficeOnline.xsl" StyleName="APA" Version="6"/>
 </file>
 
-<file path=customXml/itemProps2.xml><?xml version="1.0" encoding="utf-8"?>
-<ds:datastoreItem xmlns:ds="http://schemas.openxmlformats.org/officeDocument/2006/customXml" ds:itemID="{9E1FEEAB-B510-40FA-8CAE-DC1A4BCFB7AF}">
-  <ds:schemaRefs>
-    <ds:schemaRef ds:uri="http://schemas.microsoft.com/office/2006/metadata/properties"/>
-    <ds:schemaRef ds:uri="http://schemas.microsoft.com/office/infopath/2007/PartnerControls"/>
-    <ds:schemaRef ds:uri="c0a5e2f2-cbc9-444d-acb1-da3840c97b19"/>
-    <ds:schemaRef ds:uri="17fa7942-0d9f-40ad-9093-ce71332f67f5"/>
-  </ds:schemaRefs>
-</ds:datastoreItem>
+<file path=customXml/item3.xml><?xml version="1.0" encoding="utf-8"?>
+<p:properties xmlns:p="http://schemas.microsoft.com/office/2006/metadata/properties" xmlns:xsi="http://www.w3.org/2001/XMLSchema-instance" xmlns:pc="http://schemas.microsoft.com/office/infopath/2007/PartnerControls">
+  <documentManagement>
+    <TaxCatchAll xmlns="c0a5e2f2-cbc9-444d-acb1-da3840c97b19" xsi:nil="true"/>
+    <lcf76f155ced4ddcb4097134ff3c332f xmlns="17fa7942-0d9f-40ad-9093-ce71332f67f5">
+      <Terms xmlns="http://schemas.microsoft.com/office/infopath/2007/PartnerControls"/>
+    </lcf76f155ced4ddcb4097134ff3c332f>
+  </documentManagement>
+</p:properties>
 </file>
 
-<file path=customXml/itemProps3.xml><?xml version="1.0" encoding="utf-8"?>
-<ds:datastoreItem xmlns:ds="http://schemas.openxmlformats.org/officeDocument/2006/customXml" ds:itemID="{64FA4F1C-B507-441D-9669-8C36907E557A}">
-  <ds:schemaRefs>
-    <ds:schemaRef ds:uri="http://schemas.openxmlformats.org/officeDocument/2006/bibliography"/>
-  </ds:schemaRefs>
-</ds:datastoreItem>
+<file path=customXml/item4.xml><?xml version="1.0" encoding="utf-8"?>
+<?mso-contentType ?>
+<FormTemplates xmlns="http://schemas.microsoft.com/sharepoint/v3/contenttype/forms">
+  <Display>DocumentLibraryForm</Display>
+  <Edit>DocumentLibraryForm</Edit>
+  <New>DocumentLibraryForm</New>
+</FormTemplates>
 </file>
 
-<file path=customXml/itemProps4.xml><?xml version="1.0" encoding="utf-8"?>
+<file path=customXml/itemProps1.xml><?xml version="1.0" encoding="utf-8"?>
 <ds:datastoreItem xmlns:ds="http://schemas.openxmlformats.org/officeDocument/2006/customXml" ds:itemID="{611802FA-C135-4E57-8C02-A7974D1B7D21}">
   <ds:schemaRefs>
     <ds:schemaRef ds:uri="http://schemas.microsoft.com/office/2006/metadata/contentType"/>
@@ -6725,4 +6684,31 @@
     <ds:schemaRef ds:uri="http://schemas.microsoft.com/internal/obd"/>
   </ds:schemaRefs>
 </ds:datastoreItem>
+</file>
+
+<file path=customXml/itemProps2.xml><?xml version="1.0" encoding="utf-8"?>
+<ds:datastoreItem xmlns:ds="http://schemas.openxmlformats.org/officeDocument/2006/customXml" ds:itemID="{64FA4F1C-B507-441D-9669-8C36907E557A}">
+  <ds:schemaRefs>
+    <ds:schemaRef ds:uri="http://schemas.openxmlformats.org/officeDocument/2006/bibliography"/>
+  </ds:schemaRefs>
+</ds:datastoreItem>
+</file>
+
+<file path=customXml/itemProps3.xml><?xml version="1.0" encoding="utf-8"?>
+<ds:datastoreItem xmlns:ds="http://schemas.openxmlformats.org/officeDocument/2006/customXml" ds:itemID="{9E1FEEAB-B510-40FA-8CAE-DC1A4BCFB7AF}">
+  <ds:schemaRefs>
+    <ds:schemaRef ds:uri="http://schemas.microsoft.com/office/2006/metadata/properties"/>
+    <ds:schemaRef ds:uri="http://schemas.microsoft.com/office/infopath/2007/PartnerControls"/>
+    <ds:schemaRef ds:uri="c0a5e2f2-cbc9-444d-acb1-da3840c97b19"/>
+    <ds:schemaRef ds:uri="17fa7942-0d9f-40ad-9093-ce71332f67f5"/>
+  </ds:schemaRefs>
+</ds:datastoreItem>
+</file>
+
+<file path=customXml/itemProps4.xml><?xml version="1.0" encoding="utf-8"?>
+<ds:datastoreItem xmlns:ds="http://schemas.openxmlformats.org/officeDocument/2006/customXml" ds:itemID="{5B075FEA-4E01-4107-8B62-6F06417D51EB}">
+  <ds:schemaRefs>
+    <ds:schemaRef ds:uri="http://schemas.microsoft.com/sharepoint/v3/contenttype/forms"/>
+  </ds:schemaRefs>
+</ds:datastoreItem>
 </file>
</xml_diff>